<commit_message>
Update the marking skill to the working copy
Publishes the live ~/.claude/skills/marking at plugins/vet-marking/skills/marking,
covering the work since the last publish: the stacked-resubmission fixes, the
prescribed handover package shape with PDF SARs, per-task anchoring for a resit
handed in as a fresh file, the blanks-are-NYS check and the AMRR column widths.

Two new scripts:
  Test-SubmissionBlanks.ps1  reads a cohort together and reports unanswered
                             questions, unsigned and undated records
  Convert-RecordsToPdf.ps1   renders the handover SARs through Word

Plugin version 1.3.0 -> 1.4.0. The SKILL.md description is unchanged, so the
marketplace and README entries still read true. Local .bak and _backup-* copies
were stripped before the copy.

Co-Authored-By: Claude Opus 5 <noreply@anthropic.com>
</commit_message>
<xml_diff>
--- a/plugins/vet-marking/skills/marking/assets/templates/ACI_Construction_AMRR_Template.docx
+++ b/plugins/vet-marking/skills/marking/assets/templates/ACI_Construction_AMRR_Template.docx
@@ -476,10 +476,10 @@
         <w:gridCol w:w="1480"/>
         <w:gridCol w:w="1480"/>
         <w:gridCol w:w="1180"/>
-        <w:gridCol w:w="1620"/>
-        <w:gridCol w:w="1620"/>
+        <w:gridCol w:w="1400"/>
+        <w:gridCol w:w="1400"/>
         <w:gridCol w:w="1080"/>
-        <w:gridCol w:w="1130"/>
+        <w:gridCol w:w="1570"/>
         <w:gridCol w:w="1520"/>
         <w:gridCol w:w="1030"/>
         <w:gridCol w:w="2122"/>
@@ -635,7 +635,7 @@
         </w:tc>
         <w:tc>
           <w:tcPr>
-            <w:tcW w:w="3240" w:type="dxa"/>
+            <w:tcW w:w="2800" w:type="dxa"/>
             <w:gridSpan w:val="2"/>
             <w:tcBorders>
               <w:top w:val="single" w:sz="4" w:space="0" w:color="FFFFFF"/>
@@ -672,7 +672,7 @@
         </w:tc>
         <w:tc>
           <w:tcPr>
-            <w:tcW w:w="3730" w:type="dxa"/>
+            <w:tcW w:w="4170" w:type="dxa"/>
             <w:gridSpan w:val="3"/>
             <w:tcBorders>
               <w:top w:val="single" w:sz="4" w:space="0" w:color="FFFFFF"/>
@@ -887,7 +887,7 @@
         </w:tc>
         <w:tc>
           <w:tcPr>
-            <w:tcW w:w="1620" w:type="dxa"/>
+            <w:tcW w:w="1400" w:type="dxa"/>
             <w:tcBorders>
               <w:top w:val="single" w:sz="4" w:space="0" w:color="C3CBDA"/>
               <w:left w:val="single" w:sz="4" w:space="0" w:color="C3CBDA"/>
@@ -936,7 +936,7 @@
         </w:tc>
         <w:tc>
           <w:tcPr>
-            <w:tcW w:w="1620" w:type="dxa"/>
+            <w:tcW w:w="1400" w:type="dxa"/>
             <w:tcBorders>
               <w:top w:val="single" w:sz="4" w:space="0" w:color="C3CBDA"/>
               <w:left w:val="single" w:sz="4" w:space="0" w:color="C3CBDA"/>
@@ -1034,7 +1034,7 @@
         </w:tc>
         <w:tc>
           <w:tcPr>
-            <w:tcW w:w="1130" w:type="dxa"/>
+            <w:tcW w:w="1570" w:type="dxa"/>
             <w:tcBorders>
               <w:top w:val="single" w:sz="4" w:space="0" w:color="C3CBDA"/>
               <w:left w:val="single" w:sz="4" w:space="0" w:color="C3CBDA"/>
@@ -1343,7 +1343,7 @@
         </w:tc>
         <w:tc>
           <w:tcPr>
-            <w:tcW w:w="1620" w:type="dxa"/>
+            <w:tcW w:w="1400" w:type="dxa"/>
             <w:tcBorders>
               <w:top w:val="single" w:sz="4" w:space="0" w:color="C3CBDA"/>
               <w:left w:val="single" w:sz="4" w:space="0" w:color="C3CBDA"/>
@@ -1377,7 +1377,7 @@
         </w:tc>
         <w:tc>
           <w:tcPr>
-            <w:tcW w:w="1620" w:type="dxa"/>
+            <w:tcW w:w="1400" w:type="dxa"/>
             <w:tcBorders>
               <w:top w:val="single" w:sz="4" w:space="0" w:color="C3CBDA"/>
               <w:left w:val="single" w:sz="4" w:space="0" w:color="C3CBDA"/>
@@ -1445,7 +1445,7 @@
         </w:tc>
         <w:tc>
           <w:tcPr>
-            <w:tcW w:w="1130" w:type="dxa"/>
+            <w:tcW w:w="1570" w:type="dxa"/>
             <w:tcBorders>
               <w:top w:val="single" w:sz="4" w:space="0" w:color="C3CBDA"/>
               <w:left w:val="single" w:sz="4" w:space="0" w:color="C3CBDA"/>
@@ -1720,7 +1720,7 @@
         </w:tc>
         <w:tc>
           <w:tcPr>
-            <w:tcW w:w="1620" w:type="dxa"/>
+            <w:tcW w:w="1400" w:type="dxa"/>
             <w:tcBorders>
               <w:top w:val="single" w:sz="4" w:space="0" w:color="C3CBDA"/>
               <w:left w:val="single" w:sz="4" w:space="0" w:color="C3CBDA"/>
@@ -1755,7 +1755,7 @@
         </w:tc>
         <w:tc>
           <w:tcPr>
-            <w:tcW w:w="1620" w:type="dxa"/>
+            <w:tcW w:w="1400" w:type="dxa"/>
             <w:tcBorders>
               <w:top w:val="single" w:sz="4" w:space="0" w:color="C3CBDA"/>
               <w:left w:val="single" w:sz="4" w:space="0" w:color="C3CBDA"/>
@@ -1825,7 +1825,7 @@
         </w:tc>
         <w:tc>
           <w:tcPr>
-            <w:tcW w:w="1130" w:type="dxa"/>
+            <w:tcW w:w="1570" w:type="dxa"/>
             <w:tcBorders>
               <w:top w:val="single" w:sz="4" w:space="0" w:color="C3CBDA"/>
               <w:left w:val="single" w:sz="4" w:space="0" w:color="C3CBDA"/>
@@ -2101,7 +2101,7 @@
         </w:tc>
         <w:tc>
           <w:tcPr>
-            <w:tcW w:w="1620" w:type="dxa"/>
+            <w:tcW w:w="1400" w:type="dxa"/>
             <w:tcBorders>
               <w:top w:val="single" w:sz="4" w:space="0" w:color="C3CBDA"/>
               <w:left w:val="single" w:sz="4" w:space="0" w:color="C3CBDA"/>
@@ -2135,7 +2135,7 @@
         </w:tc>
         <w:tc>
           <w:tcPr>
-            <w:tcW w:w="1620" w:type="dxa"/>
+            <w:tcW w:w="1400" w:type="dxa"/>
             <w:tcBorders>
               <w:top w:val="single" w:sz="4" w:space="0" w:color="C3CBDA"/>
               <w:left w:val="single" w:sz="4" w:space="0" w:color="C3CBDA"/>
@@ -2203,7 +2203,7 @@
         </w:tc>
         <w:tc>
           <w:tcPr>
-            <w:tcW w:w="1130" w:type="dxa"/>
+            <w:tcW w:w="1570" w:type="dxa"/>
             <w:tcBorders>
               <w:top w:val="single" w:sz="4" w:space="0" w:color="C3CBDA"/>
               <w:left w:val="single" w:sz="4" w:space="0" w:color="C3CBDA"/>
@@ -2478,7 +2478,7 @@
         </w:tc>
         <w:tc>
           <w:tcPr>
-            <w:tcW w:w="1620" w:type="dxa"/>
+            <w:tcW w:w="1400" w:type="dxa"/>
             <w:tcBorders>
               <w:top w:val="single" w:sz="4" w:space="0" w:color="C3CBDA"/>
               <w:left w:val="single" w:sz="4" w:space="0" w:color="C3CBDA"/>
@@ -2513,7 +2513,7 @@
         </w:tc>
         <w:tc>
           <w:tcPr>
-            <w:tcW w:w="1620" w:type="dxa"/>
+            <w:tcW w:w="1400" w:type="dxa"/>
             <w:tcBorders>
               <w:top w:val="single" w:sz="4" w:space="0" w:color="C3CBDA"/>
               <w:left w:val="single" w:sz="4" w:space="0" w:color="C3CBDA"/>
@@ -2583,7 +2583,7 @@
         </w:tc>
         <w:tc>
           <w:tcPr>
-            <w:tcW w:w="1130" w:type="dxa"/>
+            <w:tcW w:w="1570" w:type="dxa"/>
             <w:tcBorders>
               <w:top w:val="single" w:sz="4" w:space="0" w:color="C3CBDA"/>
               <w:left w:val="single" w:sz="4" w:space="0" w:color="C3CBDA"/>
@@ -2859,7 +2859,7 @@
         </w:tc>
         <w:tc>
           <w:tcPr>
-            <w:tcW w:w="1620" w:type="dxa"/>
+            <w:tcW w:w="1400" w:type="dxa"/>
             <w:tcBorders>
               <w:top w:val="single" w:sz="4" w:space="0" w:color="C3CBDA"/>
               <w:left w:val="single" w:sz="4" w:space="0" w:color="C3CBDA"/>
@@ -2893,7 +2893,7 @@
         </w:tc>
         <w:tc>
           <w:tcPr>
-            <w:tcW w:w="1620" w:type="dxa"/>
+            <w:tcW w:w="1400" w:type="dxa"/>
             <w:tcBorders>
               <w:top w:val="single" w:sz="4" w:space="0" w:color="C3CBDA"/>
               <w:left w:val="single" w:sz="4" w:space="0" w:color="C3CBDA"/>
@@ -2961,7 +2961,7 @@
         </w:tc>
         <w:tc>
           <w:tcPr>
-            <w:tcW w:w="1130" w:type="dxa"/>
+            <w:tcW w:w="1570" w:type="dxa"/>
             <w:tcBorders>
               <w:top w:val="single" w:sz="4" w:space="0" w:color="C3CBDA"/>
               <w:left w:val="single" w:sz="4" w:space="0" w:color="C3CBDA"/>
@@ -3236,7 +3236,7 @@
         </w:tc>
         <w:tc>
           <w:tcPr>
-            <w:tcW w:w="1620" w:type="dxa"/>
+            <w:tcW w:w="1400" w:type="dxa"/>
             <w:tcBorders>
               <w:top w:val="single" w:sz="4" w:space="0" w:color="C3CBDA"/>
               <w:left w:val="single" w:sz="4" w:space="0" w:color="C3CBDA"/>
@@ -3271,7 +3271,7 @@
         </w:tc>
         <w:tc>
           <w:tcPr>
-            <w:tcW w:w="1620" w:type="dxa"/>
+            <w:tcW w:w="1400" w:type="dxa"/>
             <w:tcBorders>
               <w:top w:val="single" w:sz="4" w:space="0" w:color="C3CBDA"/>
               <w:left w:val="single" w:sz="4" w:space="0" w:color="C3CBDA"/>
@@ -3341,7 +3341,7 @@
         </w:tc>
         <w:tc>
           <w:tcPr>
-            <w:tcW w:w="1130" w:type="dxa"/>
+            <w:tcW w:w="1570" w:type="dxa"/>
             <w:tcBorders>
               <w:top w:val="single" w:sz="4" w:space="0" w:color="C3CBDA"/>
               <w:left w:val="single" w:sz="4" w:space="0" w:color="C3CBDA"/>
@@ -3617,7 +3617,7 @@
         </w:tc>
         <w:tc>
           <w:tcPr>
-            <w:tcW w:w="1620" w:type="dxa"/>
+            <w:tcW w:w="1400" w:type="dxa"/>
             <w:tcBorders>
               <w:top w:val="single" w:sz="4" w:space="0" w:color="C3CBDA"/>
               <w:left w:val="single" w:sz="4" w:space="0" w:color="C3CBDA"/>
@@ -3651,7 +3651,7 @@
         </w:tc>
         <w:tc>
           <w:tcPr>
-            <w:tcW w:w="1620" w:type="dxa"/>
+            <w:tcW w:w="1400" w:type="dxa"/>
             <w:tcBorders>
               <w:top w:val="single" w:sz="4" w:space="0" w:color="C3CBDA"/>
               <w:left w:val="single" w:sz="4" w:space="0" w:color="C3CBDA"/>
@@ -3719,7 +3719,7 @@
         </w:tc>
         <w:tc>
           <w:tcPr>
-            <w:tcW w:w="1130" w:type="dxa"/>
+            <w:tcW w:w="1570" w:type="dxa"/>
             <w:tcBorders>
               <w:top w:val="single" w:sz="4" w:space="0" w:color="C3CBDA"/>
               <w:left w:val="single" w:sz="4" w:space="0" w:color="C3CBDA"/>
@@ -3994,7 +3994,7 @@
         </w:tc>
         <w:tc>
           <w:tcPr>
-            <w:tcW w:w="1620" w:type="dxa"/>
+            <w:tcW w:w="1400" w:type="dxa"/>
             <w:tcBorders>
               <w:top w:val="single" w:sz="4" w:space="0" w:color="C3CBDA"/>
               <w:left w:val="single" w:sz="4" w:space="0" w:color="C3CBDA"/>
@@ -4029,7 +4029,7 @@
         </w:tc>
         <w:tc>
           <w:tcPr>
-            <w:tcW w:w="1620" w:type="dxa"/>
+            <w:tcW w:w="1400" w:type="dxa"/>
             <w:tcBorders>
               <w:top w:val="single" w:sz="4" w:space="0" w:color="C3CBDA"/>
               <w:left w:val="single" w:sz="4" w:space="0" w:color="C3CBDA"/>
@@ -4099,7 +4099,7 @@
         </w:tc>
         <w:tc>
           <w:tcPr>
-            <w:tcW w:w="1130" w:type="dxa"/>
+            <w:tcW w:w="1570" w:type="dxa"/>
             <w:tcBorders>
               <w:top w:val="single" w:sz="4" w:space="0" w:color="C3CBDA"/>
               <w:left w:val="single" w:sz="4" w:space="0" w:color="C3CBDA"/>
@@ -4375,7 +4375,7 @@
         </w:tc>
         <w:tc>
           <w:tcPr>
-            <w:tcW w:w="1620" w:type="dxa"/>
+            <w:tcW w:w="1400" w:type="dxa"/>
             <w:tcBorders>
               <w:top w:val="single" w:sz="4" w:space="0" w:color="C3CBDA"/>
               <w:left w:val="single" w:sz="4" w:space="0" w:color="C3CBDA"/>
@@ -4409,7 +4409,7 @@
         </w:tc>
         <w:tc>
           <w:tcPr>
-            <w:tcW w:w="1620" w:type="dxa"/>
+            <w:tcW w:w="1400" w:type="dxa"/>
             <w:tcBorders>
               <w:top w:val="single" w:sz="4" w:space="0" w:color="C3CBDA"/>
               <w:left w:val="single" w:sz="4" w:space="0" w:color="C3CBDA"/>
@@ -4477,7 +4477,7 @@
         </w:tc>
         <w:tc>
           <w:tcPr>
-            <w:tcW w:w="1130" w:type="dxa"/>
+            <w:tcW w:w="1570" w:type="dxa"/>
             <w:tcBorders>
               <w:top w:val="single" w:sz="4" w:space="0" w:color="C3CBDA"/>
               <w:left w:val="single" w:sz="4" w:space="0" w:color="C3CBDA"/>
@@ -4752,7 +4752,7 @@
         </w:tc>
         <w:tc>
           <w:tcPr>
-            <w:tcW w:w="1620" w:type="dxa"/>
+            <w:tcW w:w="1400" w:type="dxa"/>
             <w:tcBorders>
               <w:top w:val="single" w:sz="4" w:space="0" w:color="C3CBDA"/>
               <w:left w:val="single" w:sz="4" w:space="0" w:color="C3CBDA"/>
@@ -4787,7 +4787,7 @@
         </w:tc>
         <w:tc>
           <w:tcPr>
-            <w:tcW w:w="1620" w:type="dxa"/>
+            <w:tcW w:w="1400" w:type="dxa"/>
             <w:tcBorders>
               <w:top w:val="single" w:sz="4" w:space="0" w:color="C3CBDA"/>
               <w:left w:val="single" w:sz="4" w:space="0" w:color="C3CBDA"/>
@@ -4857,7 +4857,7 @@
         </w:tc>
         <w:tc>
           <w:tcPr>
-            <w:tcW w:w="1130" w:type="dxa"/>
+            <w:tcW w:w="1570" w:type="dxa"/>
             <w:tcBorders>
               <w:top w:val="single" w:sz="4" w:space="0" w:color="C3CBDA"/>
               <w:left w:val="single" w:sz="4" w:space="0" w:color="C3CBDA"/>
@@ -5133,7 +5133,7 @@
         </w:tc>
         <w:tc>
           <w:tcPr>
-            <w:tcW w:w="1620" w:type="dxa"/>
+            <w:tcW w:w="1400" w:type="dxa"/>
             <w:tcBorders>
               <w:top w:val="single" w:sz="4" w:space="0" w:color="C3CBDA"/>
               <w:left w:val="single" w:sz="4" w:space="0" w:color="C3CBDA"/>
@@ -5167,7 +5167,7 @@
         </w:tc>
         <w:tc>
           <w:tcPr>
-            <w:tcW w:w="1620" w:type="dxa"/>
+            <w:tcW w:w="1400" w:type="dxa"/>
             <w:tcBorders>
               <w:top w:val="single" w:sz="4" w:space="0" w:color="C3CBDA"/>
               <w:left w:val="single" w:sz="4" w:space="0" w:color="C3CBDA"/>
@@ -5235,7 +5235,7 @@
         </w:tc>
         <w:tc>
           <w:tcPr>
-            <w:tcW w:w="1130" w:type="dxa"/>
+            <w:tcW w:w="1570" w:type="dxa"/>
             <w:tcBorders>
               <w:top w:val="single" w:sz="4" w:space="0" w:color="C3CBDA"/>
               <w:left w:val="single" w:sz="4" w:space="0" w:color="C3CBDA"/>
@@ -5510,7 +5510,7 @@
         </w:tc>
         <w:tc>
           <w:tcPr>
-            <w:tcW w:w="1620" w:type="dxa"/>
+            <w:tcW w:w="1400" w:type="dxa"/>
             <w:tcBorders>
               <w:top w:val="single" w:sz="4" w:space="0" w:color="C3CBDA"/>
               <w:left w:val="single" w:sz="4" w:space="0" w:color="C3CBDA"/>
@@ -5545,7 +5545,7 @@
         </w:tc>
         <w:tc>
           <w:tcPr>
-            <w:tcW w:w="1620" w:type="dxa"/>
+            <w:tcW w:w="1400" w:type="dxa"/>
             <w:tcBorders>
               <w:top w:val="single" w:sz="4" w:space="0" w:color="C3CBDA"/>
               <w:left w:val="single" w:sz="4" w:space="0" w:color="C3CBDA"/>
@@ -5615,7 +5615,7 @@
         </w:tc>
         <w:tc>
           <w:tcPr>
-            <w:tcW w:w="1130" w:type="dxa"/>
+            <w:tcW w:w="1570" w:type="dxa"/>
             <w:tcBorders>
               <w:top w:val="single" w:sz="4" w:space="0" w:color="C3CBDA"/>
               <w:left w:val="single" w:sz="4" w:space="0" w:color="C3CBDA"/>
@@ -5891,7 +5891,7 @@
         </w:tc>
         <w:tc>
           <w:tcPr>
-            <w:tcW w:w="1620" w:type="dxa"/>
+            <w:tcW w:w="1400" w:type="dxa"/>
             <w:tcBorders>
               <w:top w:val="single" w:sz="4" w:space="0" w:color="C3CBDA"/>
               <w:left w:val="single" w:sz="4" w:space="0" w:color="C3CBDA"/>
@@ -5925,7 +5925,7 @@
         </w:tc>
         <w:tc>
           <w:tcPr>
-            <w:tcW w:w="1620" w:type="dxa"/>
+            <w:tcW w:w="1400" w:type="dxa"/>
             <w:tcBorders>
               <w:top w:val="single" w:sz="4" w:space="0" w:color="C3CBDA"/>
               <w:left w:val="single" w:sz="4" w:space="0" w:color="C3CBDA"/>
@@ -5993,7 +5993,7 @@
         </w:tc>
         <w:tc>
           <w:tcPr>
-            <w:tcW w:w="1130" w:type="dxa"/>
+            <w:tcW w:w="1570" w:type="dxa"/>
             <w:tcBorders>
               <w:top w:val="single" w:sz="4" w:space="0" w:color="C3CBDA"/>
               <w:left w:val="single" w:sz="4" w:space="0" w:color="C3CBDA"/>
@@ -6268,7 +6268,7 @@
         </w:tc>
         <w:tc>
           <w:tcPr>
-            <w:tcW w:w="1620" w:type="dxa"/>
+            <w:tcW w:w="1400" w:type="dxa"/>
             <w:tcBorders>
               <w:top w:val="single" w:sz="4" w:space="0" w:color="C3CBDA"/>
               <w:left w:val="single" w:sz="4" w:space="0" w:color="C3CBDA"/>
@@ -6303,7 +6303,7 @@
         </w:tc>
         <w:tc>
           <w:tcPr>
-            <w:tcW w:w="1620" w:type="dxa"/>
+            <w:tcW w:w="1400" w:type="dxa"/>
             <w:tcBorders>
               <w:top w:val="single" w:sz="4" w:space="0" w:color="C3CBDA"/>
               <w:left w:val="single" w:sz="4" w:space="0" w:color="C3CBDA"/>
@@ -6373,7 +6373,7 @@
         </w:tc>
         <w:tc>
           <w:tcPr>
-            <w:tcW w:w="1130" w:type="dxa"/>
+            <w:tcW w:w="1570" w:type="dxa"/>
             <w:tcBorders>
               <w:top w:val="single" w:sz="4" w:space="0" w:color="C3CBDA"/>
               <w:left w:val="single" w:sz="4" w:space="0" w:color="C3CBDA"/>
@@ -6649,7 +6649,7 @@
         </w:tc>
         <w:tc>
           <w:tcPr>
-            <w:tcW w:w="1620" w:type="dxa"/>
+            <w:tcW w:w="1400" w:type="dxa"/>
             <w:tcBorders>
               <w:top w:val="single" w:sz="4" w:space="0" w:color="C3CBDA"/>
               <w:left w:val="single" w:sz="4" w:space="0" w:color="C3CBDA"/>
@@ -6683,7 +6683,7 @@
         </w:tc>
         <w:tc>
           <w:tcPr>
-            <w:tcW w:w="1620" w:type="dxa"/>
+            <w:tcW w:w="1400" w:type="dxa"/>
             <w:tcBorders>
               <w:top w:val="single" w:sz="4" w:space="0" w:color="C3CBDA"/>
               <w:left w:val="single" w:sz="4" w:space="0" w:color="C3CBDA"/>
@@ -6751,7 +6751,7 @@
         </w:tc>
         <w:tc>
           <w:tcPr>
-            <w:tcW w:w="1130" w:type="dxa"/>
+            <w:tcW w:w="1570" w:type="dxa"/>
             <w:tcBorders>
               <w:top w:val="single" w:sz="4" w:space="0" w:color="C3CBDA"/>
               <w:left w:val="single" w:sz="4" w:space="0" w:color="C3CBDA"/>

</xml_diff>